<commit_message>
Fit the OCI-21-37 annex columns and keep the signatures on the act page
</commit_message>
<xml_diff>
--- a/templates/formats/OCI-21-37-v2.docx
+++ b/templates/formats/OCI-21-37-v2.docx
@@ -1195,7 +1195,7 @@
     </w:p>
     <w:p>
       <w:pPr>
-        <w:spacing w:before="0" w:after="0" w:line="240" w:lineRule="auto"/>
+        <w:spacing w:before="0" w:after="60" w:line="240" w:lineRule="auto"/>
         <w:jc w:val="left"/>
       </w:pPr>
       <w:r>
@@ -1463,17 +1463,17 @@
         <w:tblLook w:val="04A0" w:firstRow="1" w:lastRow="0" w:firstColumn="1" w:lastColumn="0" w:noHBand="0" w:noVBand="1"/>
       </w:tblPr>
       <w:tblGrid>
-        <w:gridCol w:w="350"/>
+        <w:gridCol w:w="600"/>
         <w:gridCol w:w="1150"/>
         <w:gridCol w:w="1150"/>
-        <w:gridCol w:w="2300"/>
+        <w:gridCol w:w="2350"/>
         <w:gridCol w:w="1100"/>
         <w:gridCol w:w="1000"/>
-        <w:gridCol w:w="1050"/>
+        <w:gridCol w:w="950"/>
+        <w:gridCol w:w="1250"/>
+        <w:gridCol w:w="1250"/>
+        <w:gridCol w:w="950"/>
         <w:gridCol w:w="1300"/>
-        <w:gridCol w:w="1300"/>
-        <w:gridCol w:w="950"/>
-        <w:gridCol w:w="1400"/>
         <w:gridCol w:w="1350"/>
       </w:tblGrid>
       <w:tr>
@@ -1483,7 +1483,7 @@
         </w:trPr>
         <w:tc>
           <w:tcPr>
-            <w:tcW w:w="350" w:type="dxa"/>
+            <w:tcW w:w="600" w:type="dxa"/>
             <w:shd w:val="clear" w:color="auto" w:fill="D9E2F3"/>
             <w:vAlign w:val="center"/>
           </w:tcPr>
@@ -1552,7 +1552,7 @@
         </w:tc>
         <w:tc>
           <w:tcPr>
-            <w:tcW w:w="2300" w:type="dxa"/>
+            <w:tcW w:w="2350" w:type="dxa"/>
             <w:shd w:val="clear" w:color="auto" w:fill="D9E2F3"/>
             <w:vAlign w:val="center"/>
           </w:tcPr>
@@ -1621,7 +1621,7 @@
         </w:tc>
         <w:tc>
           <w:tcPr>
-            <w:tcW w:w="1050" w:type="dxa"/>
+            <w:tcW w:w="950" w:type="dxa"/>
             <w:shd w:val="clear" w:color="auto" w:fill="D9E2F3"/>
             <w:vAlign w:val="center"/>
           </w:tcPr>
@@ -1644,7 +1644,7 @@
         </w:tc>
         <w:tc>
           <w:tcPr>
-            <w:tcW w:w="1300" w:type="dxa"/>
+            <w:tcW w:w="1250" w:type="dxa"/>
             <w:shd w:val="clear" w:color="auto" w:fill="D9E2F3"/>
             <w:vAlign w:val="center"/>
           </w:tcPr>
@@ -1667,7 +1667,7 @@
         </w:tc>
         <w:tc>
           <w:tcPr>
-            <w:tcW w:w="1300" w:type="dxa"/>
+            <w:tcW w:w="1250" w:type="dxa"/>
             <w:shd w:val="clear" w:color="auto" w:fill="D9E2F3"/>
             <w:vAlign w:val="center"/>
           </w:tcPr>
@@ -1713,7 +1713,7 @@
         </w:tc>
         <w:tc>
           <w:tcPr>
-            <w:tcW w:w="1400" w:type="dxa"/>
+            <w:tcW w:w="1300" w:type="dxa"/>
             <w:shd w:val="clear" w:color="auto" w:fill="D9E2F3"/>
             <w:vAlign w:val="center"/>
           </w:tcPr>
@@ -1764,7 +1764,7 @@
         </w:trPr>
         <w:tc>
           <w:tcPr>
-            <w:tcW w:w="350" w:type="dxa"/>
+            <w:tcW w:w="600" w:type="dxa"/>
             <w:vAlign w:val="center"/>
           </w:tcPr>
           <w:p>
@@ -1824,7 +1824,7 @@
         </w:tc>
         <w:tc>
           <w:tcPr>
-            <w:tcW w:w="2300" w:type="dxa"/>
+            <w:tcW w:w="2350" w:type="dxa"/>
             <w:vAlign w:val="center"/>
           </w:tcPr>
           <w:p>
@@ -1884,7 +1884,7 @@
         </w:tc>
         <w:tc>
           <w:tcPr>
-            <w:tcW w:w="1050" w:type="dxa"/>
+            <w:tcW w:w="950" w:type="dxa"/>
             <w:vAlign w:val="center"/>
           </w:tcPr>
           <w:p>
@@ -1904,7 +1904,7 @@
         </w:tc>
         <w:tc>
           <w:tcPr>
-            <w:tcW w:w="1300" w:type="dxa"/>
+            <w:tcW w:w="1250" w:type="dxa"/>
             <w:vAlign w:val="center"/>
           </w:tcPr>
           <w:p>
@@ -1924,7 +1924,7 @@
         </w:tc>
         <w:tc>
           <w:tcPr>
-            <w:tcW w:w="1300" w:type="dxa"/>
+            <w:tcW w:w="1250" w:type="dxa"/>
             <w:vAlign w:val="center"/>
           </w:tcPr>
           <w:p>
@@ -1964,7 +1964,7 @@
         </w:tc>
         <w:tc>
           <w:tcPr>
-            <w:tcW w:w="1400" w:type="dxa"/>
+            <w:tcW w:w="1300" w:type="dxa"/>
             <w:vAlign w:val="center"/>
           </w:tcPr>
           <w:p>
@@ -2068,8 +2068,8 @@
         <w:tblLook w:val="04A0" w:firstRow="1" w:lastRow="0" w:firstColumn="1" w:lastColumn="0" w:noHBand="0" w:noVBand="1"/>
       </w:tblPr>
       <w:tblGrid>
-        <w:gridCol w:w="400"/>
-        <w:gridCol w:w="4000"/>
+        <w:gridCol w:w="600"/>
+        <w:gridCol w:w="3800"/>
         <w:gridCol w:w="2200"/>
         <w:gridCol w:w="1500"/>
         <w:gridCol w:w="1900"/>
@@ -2083,7 +2083,7 @@
         </w:trPr>
         <w:tc>
           <w:tcPr>
-            <w:tcW w:w="400" w:type="dxa"/>
+            <w:tcW w:w="600" w:type="dxa"/>
             <w:shd w:val="clear" w:color="auto" w:fill="D9E2F3"/>
             <w:vAlign w:val="center"/>
           </w:tcPr>
@@ -2106,7 +2106,7 @@
         </w:tc>
         <w:tc>
           <w:tcPr>
-            <w:tcW w:w="4000" w:type="dxa"/>
+            <w:tcW w:w="3800" w:type="dxa"/>
             <w:shd w:val="clear" w:color="auto" w:fill="D9E2F3"/>
             <w:vAlign w:val="center"/>
           </w:tcPr>
@@ -2249,7 +2249,7 @@
         </w:trPr>
         <w:tc>
           <w:tcPr>
-            <w:tcW w:w="400" w:type="dxa"/>
+            <w:tcW w:w="600" w:type="dxa"/>
             <w:vAlign w:val="center"/>
           </w:tcPr>
           <w:p>
@@ -2269,7 +2269,7 @@
         </w:tc>
         <w:tc>
           <w:tcPr>
-            <w:tcW w:w="4000" w:type="dxa"/>
+            <w:tcW w:w="3800" w:type="dxa"/>
             <w:vAlign w:val="center"/>
           </w:tcPr>
           <w:p>

</xml_diff>

<commit_message>
Compute the OCI-21-37 finding percentages over purchase price and state that base in the act
</commit_message>
<xml_diff>
--- a/templates/formats/OCI-21-37-v2.docx
+++ b/templates/formats/OCI-21-37-v2.docx
@@ -449,6 +449,54 @@
                 <w:szCs w:val="18"/>
               </w:rPr>
               <w:t xml:space="preserve">{{firmante.responsable.nombre}}</w:t>
+            </w:r>
+          </w:p>
+        </w:tc>
+      </w:tr>
+      <w:tr>
+        <w:trPr>
+          <w:cantSplit/>
+        </w:trPr>
+        <w:tc>
+          <w:tcPr>
+            <w:tcW w:w="3600" w:type="dxa"/>
+            <w:shd w:val="clear" w:color="auto" w:fill="D9E2F3"/>
+            <w:vAlign w:val="center"/>
+          </w:tcPr>
+          <w:p>
+            <w:pPr>
+              <w:spacing w:before="0" w:after="0" w:line="240" w:lineRule="auto"/>
+              <w:jc w:val="left"/>
+            </w:pPr>
+            <w:r>
+              <w:rPr>
+                <w:rFonts w:ascii="Metropolis" w:eastAsia="Metropolis" w:hAnsi="Metropolis" w:cs="Metropolis"/>
+                <w:b/>
+                <w:bCs/>
+                <w:sz w:val="18"/>
+                <w:szCs w:val="18"/>
+              </w:rPr>
+              <w:t xml:space="preserve">Atendió por el área</w:t>
+            </w:r>
+          </w:p>
+        </w:tc>
+        <w:tc>
+          <w:tcPr>
+            <w:tcW w:w="10800" w:type="dxa"/>
+            <w:vAlign w:val="center"/>
+          </w:tcPr>
+          <w:p>
+            <w:pPr>
+              <w:spacing w:before="0" w:after="0" w:line="240" w:lineRule="auto"/>
+              <w:jc w:val="left"/>
+            </w:pPr>
+            <w:r>
+              <w:rPr>
+                <w:rFonts w:ascii="Metropolis" w:eastAsia="Metropolis" w:hAnsi="Metropolis" w:cs="Metropolis"/>
+                <w:sz w:val="18"/>
+                <w:szCs w:val="18"/>
+              </w:rPr>
+              <w:t xml:space="preserve">{{campos.atendioPorArea}}</w:t>
             </w:r>
           </w:p>
         </w:tc>
@@ -1176,7 +1224,7 @@
           <w:sz w:val="14"/>
           <w:szCs w:val="14"/>
         </w:rPr>
-        <w:t xml:space="preserve">Porcentaje sobre el número de bienes con categoría de hallazgo. «Sin dato»: el sistema no tiene el valor de al menos uno de los bienes de la fila; no equivale a cero.</w:t>
+        <w:t xml:space="preserve">{{campos.basePorcentaje}}: el de cada categoría es su precio de compra sobre el precio de compra total de los bienes con categoría de hallazgo. El valor en libros es otro dato y no entra en el porcentaje. «Sin dato»: el sistema no tiene el valor de al menos uno de los bienes de la fila, o el total es cero; no equivale a cero.</w:t>
       </w:r>
     </w:p>
     <w:p>

</xml_diff>